<commit_message>
Rewrite the ETRN video ending into a soft request for the next breakdown.
The close states the finished document, then asks the viewer to leave their next shipping scheme. It does not pitch the company.

Co-authored-by: slitasov <slitasov@users.noreply.github.com>
</commit_message>
<xml_diff>
--- a/сценарии видео.docx
+++ b/сценарии видео.docx
@@ -657,104 +657,49 @@
     </w:p>
     <w:p>
       <w:r>
-        <w:rPr>
-          <w:b/>
-          <w:bCs/>
-        </w:rPr>
-        <w:t>Что показываем:</w:t>
-      </w:r>
-      <w:r>
-        <w:t xml:space="preserve"> </w:t>
-      </w:r>
-      <w:r>
-        <w:t xml:space="preserve">ЭТрН завершена. </w:t>
-      </w:r>
-      <w:r>
-        <w:rPr>
-          <w:i/>
-          <w:iCs/>
-          <w:color w:val="FF0000"/>
-        </w:rPr>
-        <w:t>Дальше тут должна быть какая-то реклама?»</w:t>
-      </w:r>
-    </w:p>
-    <w:p>
-      <w:pPr>
-        <w:rPr>
-          <w:b/>
-          <w:bCs/>
-        </w:rPr>
-      </w:pPr>
-      <w:r>
-        <w:rPr>
-          <w:b/>
-          <w:bCs/>
-        </w:rPr>
-        <w:t>Оля:</w:t>
-      </w:r>
-      <w:r>
-        <w:rPr>
-          <w:b/>
-          <w:bCs/>
-        </w:rPr>
-        <w:t xml:space="preserve"> </w:t>
-      </w:r>
-      <w:r>
-        <w:t>«</w:t>
-      </w:r>
-      <w:r>
-        <w:t xml:space="preserve">Таким образом, документ ЭТрН полностью заполнен для сценария, когда грузоотправитель и грузоперевозчик – одно лицо. </w:t>
-      </w:r>
-      <w:r>
-        <w:rPr>
-          <w:i/>
-          <w:iCs/>
-          <w:color w:val="FF0000"/>
-        </w:rPr>
-        <w:t>Дальше тут должна быть какая-то реклама?</w:t>
-      </w:r>
-      <w:r>
-        <w:rPr>
-          <w:i/>
-          <w:iCs/>
-          <w:color w:val="FF0000"/>
-        </w:rPr>
-        <w:t>»</w:t>
-      </w:r>
-    </w:p>
-    <w:p>
-      <w:r>
-        <w:rPr>
-          <w:b/>
-          <w:bCs/>
-        </w:rPr>
+        <w:t>Что показываем: 2–3 секунды держим завершённую ЭТрН, затем плашка до конца фразы. На плашке только три короткие строки. Без слогана, телефона, перечня услуг и названия компании. Концовка звучит 15–18 секунд.</w:t>
+      </w:r>
+    </w:p>
+    <w:p>
+      <w:pPr>
+        <w:rPr>
+          <w:b/>
+          <w:bCs/>
+        </w:rPr>
+      </w:pPr>
+      <w:r>
+        <w:t>Оля: «ЭТрН для своей доставки готова: одна организация в двух ролях, титулы подписаны».</w:t>
+      </w:r>
+    </w:p>
+    <w:p>
+      <w:r>
+        <w:t>«Хотите получать такие же короткие разборы — оставьте заявку и напишите, какая перевозка у вас следующая. По ней пришлём первый материал».</w:t>
+      </w:r>
+    </w:p>
+    <w:p>
+      <w:pPr/>
+      <w:r>
         <w:t>Сноска на экране:</w:t>
       </w:r>
-      <w:r>
-        <w:rPr>
-          <w:b/>
-          <w:bCs/>
-        </w:rPr>
-        <w:t xml:space="preserve"> </w:t>
-      </w:r>
-      <w:r>
-        <w:t>Документооборот завершен.</w:t>
-      </w:r>
-      <w:r>
-        <w:rPr>
-          <w:i/>
-          <w:iCs/>
-          <w:color w:val="FF0000"/>
-        </w:rPr>
-        <w:t xml:space="preserve"> </w:t>
-      </w:r>
-      <w:r>
-        <w:rPr>
-          <w:i/>
-          <w:iCs/>
-          <w:color w:val="FF0000"/>
-        </w:rPr>
-        <w:t>Дальше тут должна быть какая-то реклама?</w:t>
+    </w:p>
+    <w:p>
+      <w:pPr>
+        <w:pStyle w:val="a7"/>
+      </w:pPr>
+      <w:r>
+        <w:t>«Документооборот завершён»</w:t>
+      </w:r>
+    </w:p>
+    <w:p>
+      <w:pPr/>
+      <w:r>
+        <w:t>«Оставьте заявку»</w:t>
+      </w:r>
+    </w:p>
+    <w:p>
+      <w:pPr/>
+      <w:r>
+        <w:t>«Напишите следующую перевозку — пришлём разбор»</w:t>
       </w:r>
     </w:p>
     <w:sectPr>

</xml_diff>

<commit_message>
Split the video ending into Olya's lines and the exact on-screen text.
The first shot stays on the finished consignment note. The second shot is a two-line card that appears as she asks for the next shipping scenario.

Co-authored-by: slitasov <slitasov@users.noreply.github.com>
</commit_message>
<xml_diff>
--- a/сценарии видео.docx
+++ b/сценарии видео.docx
@@ -657,49 +657,59 @@
     </w:p>
     <w:p>
       <w:r>
-        <w:t>Что показываем: 2–3 секунды держим завершённую ЭТрН, затем плашка до конца фразы. На плашке только три короткие строки. Без слогана, телефона, перечня услуг и названия компании. Концовка звучит 15–18 секунд.</w:t>
-      </w:r>
-    </w:p>
-    <w:p>
-      <w:pPr>
-        <w:rPr>
-          <w:b/>
-          <w:bCs/>
-        </w:rPr>
-      </w:pPr>
-      <w:r>
-        <w:t>Оля: «ЭТрН для своей доставки готова: одна организация в двух ролях, титулы подписаны».</w:t>
-      </w:r>
-    </w:p>
-    <w:p>
-      <w:r>
-        <w:t>«Хотите получать такие же короткие разборы — оставьте заявку и напишите, какая перевозка у вас следующая. По ней пришлём первый материал».</w:t>
+        <w:t>Кадр 1. Завершённая ЭТрН, держим 3 секунды. Сноска снизу, тем же размером, что в шагах выше.</w:t>
+      </w:r>
+    </w:p>
+    <w:p>
+      <w:pPr>
+        <w:rPr>
+          <w:b/>
+          <w:bCs/>
+        </w:rPr>
+      </w:pPr>
+      <w:r>
+        <w:t>Оля: «ЭТрН для своей доставки готова».</w:t>
+      </w:r>
+    </w:p>
+    <w:p>
+      <w:r>
+        <w:t>Текст на экране: «Документооборот завершён»</w:t>
       </w:r>
     </w:p>
     <w:p>
       <w:pPr/>
-      <w:r>
-        <w:t>Сноска на экране:</w:t>
-      </w:r>
+      <w:r/>
     </w:p>
     <w:p>
       <w:pPr>
         <w:pStyle w:val="a7"/>
       </w:pPr>
       <w:r>
-        <w:t>«Документооборот завершён»</w:t>
+        <w:t>Кадр 2. Сразу после первой фразы уходим с документа на плашку и держим её до конца ролика. Две строки по центру. Без названия компании, слогана и телефона.</w:t>
       </w:r>
     </w:p>
     <w:p>
       <w:pPr/>
       <w:r>
+        <w:t>Оля: «Хотите получать такие же короткие разборы — оставьте заявку и напишите, какая перевозка у вас следующая».</w:t>
+      </w:r>
+    </w:p>
+    <w:p>
+      <w:pPr/>
+      <w:r>
+        <w:t>Текст на экране:</w:t>
+      </w:r>
+    </w:p>
+    <w:p>
+      <w:pPr/>
+      <w:r>
         <w:t>«Оставьте заявку»</w:t>
       </w:r>
     </w:p>
     <w:p>
       <w:pPr/>
       <w:r>
-        <w:t>«Напишите следующую перевозку — пришлём разбор»</w:t>
+        <w:t>«Напишите следующую перевозку»</w:t>
       </w:r>
     </w:p>
     <w:sectPr>

</xml_diff>

<commit_message>
Make the ending offer the viewer's own shipment and a QR code.
Olya asks to review their delivery and help with setup. The end card shows the request code instead of a company line.

Co-authored-by: slitasov <slitasov@users.noreply.github.com>
</commit_message>
<xml_diff>
--- a/сценарии видео.docx
+++ b/сценарии видео.docx
@@ -656,60 +656,60 @@
       </w:r>
     </w:p>
     <w:p>
+      <w:pPr/>
       <w:r>
         <w:t>Кадр 1. Завершённая ЭТрН, держим 3 секунды. Сноска снизу, тем же размером, что в шагах выше.</w:t>
       </w:r>
     </w:p>
     <w:p>
-      <w:pPr>
-        <w:rPr>
-          <w:b/>
-          <w:bCs/>
-        </w:rPr>
-      </w:pPr>
+      <w:pPr/>
       <w:r>
         <w:t>Оля: «ЭТрН для своей доставки готова».</w:t>
       </w:r>
     </w:p>
     <w:p>
+      <w:pPr/>
       <w:r>
         <w:t>Текст на экране: «Документооборот завершён»</w:t>
       </w:r>
     </w:p>
     <w:p>
       <w:pPr/>
-      <w:r/>
-    </w:p>
-    <w:p>
-      <w:pPr>
-        <w:pStyle w:val="a7"/>
-      </w:pPr>
-      <w:r>
-        <w:t>Кадр 2. Сразу после первой фразы уходим с документа на плашку и держим её до конца ролика. Две строки по центру. Без названия компании, слогана и телефона.</w:t>
-      </w:r>
     </w:p>
     <w:p>
       <w:pPr/>
       <w:r>
-        <w:t>Оля: «Хотите получать такие же короткие разборы — оставьте заявку и напишите, какая перевозка у вас следующая».</w:t>
+        <w:t>Кадр 2. Сразу после первой фразы уходим с документа на плашку и держим её, пока Оля договаривает. По центру крупный QR-код заявки. Над кодом одна строка, под кодом одна строка. Без названия компании, слогана и телефона.</w:t>
       </w:r>
     </w:p>
     <w:p>
       <w:pPr/>
       <w:r>
+        <w:t>Оля: «Хотите, чтобы всё работало не только у героев видео, но и в вашей программе? Наведите камеру на код и оставьте заявку: разберём вашу перевозку и поможем с подключением и настройкой».</w:t>
+      </w:r>
+    </w:p>
+    <w:p>
+      <w:pPr/>
+      <w:r>
         <w:t>Текст на экране:</w:t>
       </w:r>
     </w:p>
     <w:p>
       <w:pPr/>
       <w:r>
-        <w:t>«Оставьте заявку»</w:t>
+        <w:t>Над кодом: «Разберём вашу перевозку»</w:t>
       </w:r>
     </w:p>
     <w:p>
       <w:pPr/>
       <w:r>
-        <w:t>«Напишите следующую перевозку»</w:t>
+        <w:t>По центру: QR-код заявки</w:t>
+      </w:r>
+    </w:p>
+    <w:p>
+      <w:pPr/>
+      <w:r>
+        <w:t>Под кодом: «Оставьте заявку»</w:t>
       </w:r>
     </w:p>
     <w:sectPr>

</xml_diff>